<commit_message>
L-071 and the morning record for 3 September
L-071 at scope ALL: a rule enforced on the record is not enforced on the
document. It is easier to check a machine-readable record than the report a
reader opens, so that is where checks get written — and the record can be brought
into line while the document goes on saying the old thing.

MORNING.md items 51-55: the mechanical fair value and why it cannot be built;
TMGH's six corroborated share counts and the treasury movement the method caught;
the deliverables gate and the TMGH QC gap it found; [R-LENS-03] green in every
record and false in fourteen of twenty documents; and AMOC's contested
alternatives sitting on a superseded bridge.

Co-Authored-By: Claude Opus 5 <noreply@anthropic.com>
Claude-Session: https://claude.ai/code/session_017RcjXG4ETjADcoFJf123yY
</commit_message>
<xml_diff>
--- a/engine/Lessons_Register.docx
+++ b/engine/Lessons_Register.docx
@@ -430,7 +430,7 @@
                 <w:color w:val="1A1D21"/>
                 <w:sz w:val="18"/>
               </w:rPr>
-              <w:t>75</w:t>
+              <w:t>76</w:t>
             </w:r>
           </w:p>
         </w:tc>
@@ -526,7 +526,7 @@
                 <w:color w:val="1A1D21"/>
                 <w:sz w:val="18"/>
               </w:rPr>
-              <w:t>102</w:t>
+              <w:t>103</w:t>
             </w:r>
           </w:p>
         </w:tc>
@@ -684,7 +684,7 @@
                 <w:color w:val="1A1D21"/>
                 <w:sz w:val="18"/>
               </w:rPr>
-              <w:t>18</w:t>
+              <w:t>19</w:t>
             </w:r>
           </w:p>
         </w:tc>
@@ -6742,6 +6742,85 @@
           <w:sz w:val="19"/>
         </w:rPr>
         <w:t>What would overturn it.  A case where the simpler construction is the one a reader receives — then it is the headline that is inconsistent with the alternatives, not the other way round, and the fix runs in the opposite direction.</w:t>
+      </w:r>
+    </w:p>
+    <w:p>
+      <w:pPr>
+        <w:keepNext/>
+        <w:spacing w:before="240" w:after="60"/>
+      </w:pPr>
+      <w:r>
+        <w:rPr>
+          <w:b/>
+          <w:color w:val="1A1D21"/>
+          <w:sz w:val="22"/>
+        </w:rPr>
+        <w:t>L-071  A rule enforced on the record is not enforced on the document.</w:t>
+      </w:r>
+    </w:p>
+    <w:p>
+      <w:pPr>
+        <w:keepNext/>
+        <w:spacing w:after="100"/>
+      </w:pPr>
+      <w:r>
+        <w:rPr>
+          <w:b/>
+          <w:color w:val="1D6FA3"/>
+          <w:sz w:val="16"/>
+        </w:rPr>
+        <w:t>EVERY STUDY</w:t>
+      </w:r>
+      <w:r>
+        <w:rPr>
+          <w:color w:val="5B6570"/>
+          <w:sz w:val="16"/>
+        </w:rPr>
+        <w:t xml:space="preserve">   applies to every study   ·   learned from a self-audit, method reassessment WS8, lens vocabulary in delivered documents, 03-Sep-2026</w:t>
+      </w:r>
+    </w:p>
+    <w:p>
+      <w:pPr>
+        <w:spacing w:after="100"/>
+      </w:pPr>
+      <w:r>
+        <w:rPr>
+          <w:b w:val="0"/>
+          <w:i w:val="0"/>
+          <w:color w:val="1A1D21"/>
+          <w:sz w:val="21"/>
+        </w:rPr>
+        <w:t>It is much easier to check a machine-readable record than the report a reader actually opens, so that is where checks get written — and the record can be brought into line while the document goes on saying the old thing. When a rule governs what a reader is TOLD, the check has to read what the reader receives.</w:t>
+      </w:r>
+    </w:p>
+    <w:p>
+      <w:pPr>
+        <w:spacing w:after="60"/>
+        <w:ind w:left="283"/>
+      </w:pPr>
+      <w:r>
+        <w:rPr>
+          <w:b w:val="0"/>
+          <w:i w:val="0"/>
+          <w:color w:val="5B6570"/>
+          <w:sz w:val="19"/>
+        </w:rPr>
+        <w:t>How we know.  [R-LENS-03] retired the typed multi-lens blend and is enforced on each study's committed lens record, which was green everywhere. Reading the delivered PDFs instead: 6 of 20 carried no weighted blend and 14 published a weighted central as the study's own answer. ARCC had been RE-ISSUED after the rule and its document prints a weighted central of 54.65 beside a numbers file carrying 53.46. ADNOCLS, the model report every study is opened beside, carried twenty-two such assertions — so the exemplar was teaching the retired architecture to every study that followed.</w:t>
+      </w:r>
+    </w:p>
+    <w:p>
+      <w:pPr>
+        <w:spacing w:after="160"/>
+        <w:ind w:left="283"/>
+      </w:pPr>
+      <w:r>
+        <w:rPr>
+          <w:b w:val="0"/>
+          <w:i w:val="0"/>
+          <w:color w:val="5B6570"/>
+          <w:sz w:val="19"/>
+        </w:rPr>
+        <w:t>What would overturn it.  A rule whose whole content IS the record — a provenance field, a stamp, an attestation — has nothing in the document to check, and reading the document for it would find nothing. The test is whether the rule governs what a reader is told.</w:t>
       </w:r>
     </w:p>
     <w:p>

</xml_diff>

<commit_message>
[R-DOC-01] the sign-convention clause into both documents; L-267
Extended as a clause of the same [R-ENF-01 EXTENDED 04-Sep-2026] paragraph
rather than written as a second rule — the two halves are one subject (a page
that instructs a reader) split by whether the page says enough to be checked
from, and a rule restated in two places is the drift [R-DOC-01] closes.

Both stamps at 2026-09-04b.

Co-Authored-By: Claude Opus 5 <noreply@anthropic.com>
Claude-Session: https://claude.ai/code/session_017RcjXG4ETjADcoFJf123yY
</commit_message>
<xml_diff>
--- a/engine/Lessons_Register.docx
+++ b/engine/Lessons_Register.docx
@@ -430,7 +430,7 @@
                 <w:color w:val="1A1D21"/>
                 <w:sz w:val="18"/>
               </w:rPr>
-              <w:t>160</w:t>
+              <w:t>161</w:t>
             </w:r>
           </w:p>
         </w:tc>
@@ -526,7 +526,7 @@
                 <w:color w:val="1A1D21"/>
                 <w:sz w:val="18"/>
               </w:rPr>
-              <w:t>187</w:t>
+              <w:t>188</w:t>
             </w:r>
           </w:p>
         </w:tc>
@@ -716,7 +716,7 @@
                 <w:color w:val="1A1D21"/>
                 <w:sz w:val="18"/>
               </w:rPr>
-              <w:t>112</w:t>
+              <w:t>113</w:t>
             </w:r>
           </w:p>
         </w:tc>
@@ -13868,6 +13868,85 @@
           <w:sz w:val="19"/>
         </w:rPr>
         <w:t>What would overturn it.  An exception class where the reason is genuinely mechanical and stating it adds nothing, which would need to be shown rather than asserted.</w:t>
+      </w:r>
+    </w:p>
+    <w:p>
+      <w:pPr>
+        <w:keepNext/>
+        <w:spacing w:before="240" w:after="60"/>
+      </w:pPr>
+      <w:r>
+        <w:rPr>
+          <w:b/>
+          <w:color w:val="1A1D21"/>
+          <w:sz w:val="22"/>
+        </w:rPr>
+        <w:t>L-267  A TABLE USES ONE SIGN CONVENTION FOR ITS DEDUCTIONS, AND A LABEL SAYING "LESS" OVER A FIGURE THE MODEL ADDS IS WRONG WHATEVER THE ARITHMETIC DOES.</w:t>
+      </w:r>
+    </w:p>
+    <w:p>
+      <w:pPr>
+        <w:keepNext/>
+        <w:spacing w:after="100"/>
+      </w:pPr>
+      <w:r>
+        <w:rPr>
+          <w:b/>
+          <w:color w:val="1D6FA3"/>
+          <w:sz w:val="16"/>
+        </w:rPr>
+        <w:t>EVERY STUDY</w:t>
+      </w:r>
+      <w:r>
+        <w:rPr>
+          <w:color w:val="5B6570"/>
+          <w:sz w:val="16"/>
+        </w:rPr>
+        <w:t xml:space="preserve">   applies to every study   ·   learned from a found while building, measuring the delivered documents, 04-Sep-2026</w:t>
+      </w:r>
+    </w:p>
+    <w:p>
+      <w:pPr>
+        <w:spacing w:after="100"/>
+      </w:pPr>
+      <w:r>
+        <w:rPr>
+          <w:b w:val="0"/>
+          <w:i w:val="0"/>
+          <w:color w:val="1A1D21"/>
+          <w:sz w:val="21"/>
+        </w:rPr>
+        <w:t>A deduction can be printed in parentheses, as a signed negative, or as a bare magnitude. Any one of the three is clear. Two of them in one table means a reader does not know whether to take the magnitude off or add the sign — and the same row printing 855 in one year and -4,550 in the next, under one label, is something nobody can read correctly.</w:t>
+      </w:r>
+    </w:p>
+    <w:p>
+      <w:pPr>
+        <w:spacing w:after="60"/>
+        <w:ind w:left="283"/>
+      </w:pPr>
+      <w:r>
+        <w:rPr>
+          <w:b w:val="0"/>
+          <w:i w:val="0"/>
+          <w:color w:val="5B6570"/>
+          <w:sz w:val="19"/>
+        </w:rPr>
+        <w:t>How we know.  Nine of the 100 tables in the book that carry a deduction row print two conventions at once, and in every one of the nine the row breaking the convention is a working-capital line the model ADDS while its label says "Less". One prints "(2,650)", "(360)", "(792)", "(1,012)" and then "440", so a reader following the labels reaches 3,488 against a printed 4,368 — twenty per cent of that year's cash flow. Three of the nine switch convention between adjacent years in a single row. The semantic defect beneath it is the real one: "Less INCREASE in working capital" over a release states the opposite of what happened.</w:t>
+      </w:r>
+    </w:p>
+    <w:p>
+      <w:pPr>
+        <w:spacing w:after="160"/>
+        <w:ind w:left="283"/>
+      </w:pPr>
+      <w:r>
+        <w:rPr>
+          <w:b w:val="0"/>
+          <w:i w:val="0"/>
+          <w:color w:val="5B6570"/>
+          <w:sz w:val="19"/>
+        </w:rPr>
+        <w:t>What would overturn it.  A table whose two conventions are two different quantities rather than two readings of one — a rate beside its amount, which the check already distinguishes and which is why it distinguishes them.</w:t>
       </w:r>
     </w:p>
     <w:p>

</xml_diff>

<commit_message>
L-268: compute the whole file before opening anything for writing
The commit before this one names L-268 and it had not been registered.

Co-Authored-By: Claude Opus 5 <noreply@anthropic.com>
Claude-Session: https://claude.ai/code/session_017RcjXG4ETjADcoFJf123yY
</commit_message>
<xml_diff>
--- a/engine/Lessons_Register.docx
+++ b/engine/Lessons_Register.docx
@@ -430,7 +430,7 @@
                 <w:color w:val="1A1D21"/>
                 <w:sz w:val="18"/>
               </w:rPr>
-              <w:t>161</w:t>
+              <w:t>162</w:t>
             </w:r>
           </w:p>
         </w:tc>
@@ -526,7 +526,7 @@
                 <w:color w:val="1A1D21"/>
                 <w:sz w:val="18"/>
               </w:rPr>
-              <w:t>188</w:t>
+              <w:t>189</w:t>
             </w:r>
           </w:p>
         </w:tc>
@@ -716,7 +716,7 @@
                 <w:color w:val="1A1D21"/>
                 <w:sz w:val="18"/>
               </w:rPr>
-              <w:t>113</w:t>
+              <w:t>114</w:t>
             </w:r>
           </w:p>
         </w:tc>
@@ -13947,6 +13947,85 @@
           <w:sz w:val="19"/>
         </w:rPr>
         <w:t>What would overturn it.  A table whose two conventions are two different quantities rather than two readings of one — a rate beside its amount, which the check already distinguishes and which is why it distinguishes them.</w:t>
+      </w:r>
+    </w:p>
+    <w:p>
+      <w:pPr>
+        <w:keepNext/>
+        <w:spacing w:before="240" w:after="60"/>
+      </w:pPr>
+      <w:r>
+        <w:rPr>
+          <w:b/>
+          <w:color w:val="1A1D21"/>
+          <w:sz w:val="22"/>
+        </w:rPr>
+        <w:t>L-268  COMPUTE THE WHOLE NEW FILE BEFORE OPENING ANYTHING FOR WRITING — AN OPEN IN WRITE MODE TRUNCATES BEFORE THE EXPRESSION BESIDE IT IS EVALUATED.</w:t>
+      </w:r>
+    </w:p>
+    <w:p>
+      <w:pPr>
+        <w:keepNext/>
+        <w:spacing w:after="100"/>
+      </w:pPr>
+      <w:r>
+        <w:rPr>
+          <w:b/>
+          <w:color w:val="1D6FA3"/>
+          <w:sz w:val="16"/>
+        </w:rPr>
+        <w:t>EVERY STUDY</w:t>
+      </w:r>
+      <w:r>
+        <w:rPr>
+          <w:color w:val="5B6570"/>
+          <w:sz w:val="16"/>
+        </w:rPr>
+        <w:t xml:space="preserve">   applies to every study   ·   learned from a found while building, truncating a study builder to zero bytes, 04-Sep-2026</w:t>
+      </w:r>
+    </w:p>
+    <w:p>
+      <w:pPr>
+        <w:spacing w:after="100"/>
+      </w:pPr>
+      <w:r>
+        <w:rPr>
+          <w:b w:val="0"/>
+          <w:i w:val="0"/>
+          <w:color w:val="1A1D21"/>
+          <w:sz w:val="21"/>
+        </w:rPr>
+        <w:t>open(path, 'w').write(f(text)) evaluates the open FIRST. If f() then raises, the file is already empty and the exception looks like nothing happened. Build the new text in full, and only then open the file.</w:t>
+      </w:r>
+    </w:p>
+    <w:p>
+      <w:pPr>
+        <w:spacing w:after="60"/>
+        <w:ind w:left="283"/>
+      </w:pPr>
+      <w:r>
+        <w:rPr>
+          <w:b w:val="0"/>
+          <w:i w:val="0"/>
+          <w:color w:val="5B6570"/>
+          <w:sz w:val="19"/>
+        </w:rPr>
+        <w:t>How we know.  A patch script applying the same edit to six builders wrote io.open(p,'w').write(add_import(s)); on the second file add_import raised because that builder has no sys.path preamble, and the traceback was the only sign that the file had already been emptied — 1,023 lines gone, recovered from git because it happened to be committed. Nothing about the error message mentioned the file.</w:t>
+      </w:r>
+    </w:p>
+    <w:p>
+      <w:pPr>
+        <w:spacing w:after="160"/>
+        <w:ind w:left="283"/>
+      </w:pPr>
+      <w:r>
+        <w:rPr>
+          <w:b w:val="0"/>
+          <w:i w:val="0"/>
+          <w:color w:val="5B6570"/>
+          <w:sz w:val="19"/>
+        </w:rPr>
+        <w:t>What would overturn it.  A write path where the truncation genuinely cannot precede the failure, such as writing to a temporary file and renaming it, which is the stronger form of this same discipline.</w:t>
       </w:r>
     </w:p>
     <w:p>

</xml_diff>

<commit_message>
[R-DOC-01] the exemplar rule into both documents; L-269
Both stamps at 2026-09-04c.

The general lesson is the one worth keeping: every explicit rule in this
repository is enforced from outside by something, and the instruction to copy a
document was enforced by nothing — while having the widest reach of any of them,
because it transmits not the rules somebody remembered to write down but every
property the template happens to have.

Co-Authored-By: Claude Opus 5 <noreply@anthropic.com>
Claude-Session: https://claude.ai/code/session_017RcjXG4ETjADcoFJf123yY
</commit_message>
<xml_diff>
--- a/engine/Lessons_Register.docx
+++ b/engine/Lessons_Register.docx
@@ -430,7 +430,7 @@
                 <w:color w:val="1A1D21"/>
                 <w:sz w:val="18"/>
               </w:rPr>
-              <w:t>162</w:t>
+              <w:t>163</w:t>
             </w:r>
           </w:p>
         </w:tc>
@@ -526,7 +526,7 @@
                 <w:color w:val="1A1D21"/>
                 <w:sz w:val="18"/>
               </w:rPr>
-              <w:t>189</w:t>
+              <w:t>190</w:t>
             </w:r>
           </w:p>
         </w:tc>
@@ -716,7 +716,7 @@
                 <w:color w:val="1A1D21"/>
                 <w:sz w:val="18"/>
               </w:rPr>
-              <w:t>114</w:t>
+              <w:t>115</w:t>
             </w:r>
           </w:p>
         </w:tc>
@@ -14026,6 +14026,85 @@
           <w:sz w:val="19"/>
         </w:rPr>
         <w:t>What would overturn it.  A write path where the truncation genuinely cannot precede the failure, such as writing to a temporary file and renaming it, which is the stronger form of this same discipline.</w:t>
+      </w:r>
+    </w:p>
+    <w:p>
+      <w:pPr>
+        <w:keepNext/>
+        <w:spacing w:before="240" w:after="60"/>
+      </w:pPr>
+      <w:r>
+        <w:rPr>
+          <w:b/>
+          <w:color w:val="1A1D21"/>
+          <w:sz w:val="22"/>
+        </w:rPr>
+        <w:t>L-269  A TEMPLATE IS AN UNWRITTEN RULE WITH NOBODY CHECKING IT, AND IT TRANSMITS EVERY PROPERTY IT HAPPENS TO HAVE.</w:t>
+      </w:r>
+    </w:p>
+    <w:p>
+      <w:pPr>
+        <w:keepNext/>
+        <w:spacing w:after="100"/>
+      </w:pPr>
+      <w:r>
+        <w:rPr>
+          <w:b/>
+          <w:color w:val="1D6FA3"/>
+          <w:sz w:val="16"/>
+        </w:rPr>
+        <w:t>EVERY STUDY</w:t>
+      </w:r>
+      <w:r>
+        <w:rPr>
+          <w:color w:val="5B6570"/>
+          <w:sz w:val="16"/>
+        </w:rPr>
+        <w:t xml:space="preserve">   applies to every study   ·   learned from a found while building, measuring the model report against the ratchets, 04-Sep-2026</w:t>
+      </w:r>
+    </w:p>
+    <w:p>
+      <w:pPr>
+        <w:spacing w:after="100"/>
+      </w:pPr>
+      <w:r>
+        <w:rPr>
+          <w:b w:val="0"/>
+          <w:i w:val="0"/>
+          <w:color w:val="1A1D21"/>
+          <w:sz w:val="21"/>
+        </w:rPr>
+        <w:t>Where a process propagates by imitation — open this document beside the one you are writing — the thing imitated IS the standard, whatever the documents say. It carries not the rules somebody remembered to write down but everything the template contains, including the constructions later rules retired.</w:t>
+      </w:r>
+    </w:p>
+    <w:p>
+      <w:pPr>
+        <w:spacing w:after="60"/>
+        <w:ind w:left="283"/>
+      </w:pPr>
+      <w:r>
+        <w:rPr>
+          <w:b w:val="0"/>
+          <w:i w:val="0"/>
+          <w:color w:val="5B6570"/>
+          <w:sz w:val="19"/>
+        </w:rPr>
+        <w:t>How we know.  The exemplar every study in this house is modelled on was outstanding on EIGHT ratchets at once — among them lens design, so it still publishes the typed four-lens blend that rule retired, and the valuation gap, where it is listed UNREADABLE, meaning that gate cannot recover a central and a spot from the document every other study is copied from. Not one of those entries was wrong; that is what a ratchet is for. Nothing was counting them on THIS study, and a ratchet entry on the exemplar is a debt every study written afterwards owes without anybody deciding to take it on.</w:t>
+      </w:r>
+    </w:p>
+    <w:p>
+      <w:pPr>
+        <w:spacing w:after="160"/>
+        <w:ind w:left="283"/>
+      </w:pPr>
+      <w:r>
+        <w:rPr>
+          <w:b w:val="0"/>
+          <w:i w:val="0"/>
+          <w:color w:val="5B6570"/>
+          <w:sz w:val="19"/>
+        </w:rPr>
+        <w:t>What would overturn it.  A house whose studies are written from the rules rather than from a template, where the exemplar's own state would stop propagating.</w:t>
       </w:r>
     </w:p>
     <w:p>

</xml_diff>

<commit_message>
[R-DOC-01] the source-integrity rule into both documents; L-270, L-271
Both stamps at 2026-09-04d.

Co-Authored-By: Claude Opus 5 <noreply@anthropic.com>
Claude-Session: https://claude.ai/code/session_017RcjXG4ETjADcoFJf123yY
</commit_message>
<xml_diff>
--- a/engine/Lessons_Register.docx
+++ b/engine/Lessons_Register.docx
@@ -430,7 +430,7 @@
                 <w:color w:val="1A1D21"/>
                 <w:sz w:val="18"/>
               </w:rPr>
-              <w:t>163</w:t>
+              <w:t>165</w:t>
             </w:r>
           </w:p>
         </w:tc>
@@ -526,7 +526,7 @@
                 <w:color w:val="1A1D21"/>
                 <w:sz w:val="18"/>
               </w:rPr>
-              <w:t>190</w:t>
+              <w:t>192</w:t>
             </w:r>
           </w:p>
         </w:tc>
@@ -716,7 +716,7 @@
                 <w:color w:val="1A1D21"/>
                 <w:sz w:val="18"/>
               </w:rPr>
-              <w:t>115</w:t>
+              <w:t>117</w:t>
             </w:r>
           </w:p>
         </w:tc>
@@ -14105,6 +14105,164 @@
           <w:sz w:val="19"/>
         </w:rPr>
         <w:t>What would overturn it.  A house whose studies are written from the rules rather than from a template, where the exemplar's own state would stop propagating.</w:t>
+      </w:r>
+    </w:p>
+    <w:p>
+      <w:pPr>
+        <w:keepNext/>
+        <w:spacing w:before="240" w:after="60"/>
+      </w:pPr>
+      <w:r>
+        <w:rPr>
+          <w:b/>
+          <w:color w:val="1A1D21"/>
+          <w:sz w:val="22"/>
+        </w:rPr>
+        <w:t>L-270  THE OLDEST RULES ARE THE LEAST CHECKED, BECAUSE THEY PREDATE THE MACHINERY.</w:t>
+      </w:r>
+    </w:p>
+    <w:p>
+      <w:pPr>
+        <w:keepNext/>
+        <w:spacing w:after="100"/>
+      </w:pPr>
+      <w:r>
+        <w:rPr>
+          <w:b/>
+          <w:color w:val="1D6FA3"/>
+          <w:sz w:val="16"/>
+        </w:rPr>
+        <w:t>EVERY STUDY</w:t>
+      </w:r>
+      <w:r>
+        <w:rPr>
+          <w:color w:val="5B6570"/>
+          <w:sz w:val="16"/>
+        </w:rPr>
+        <w:t xml:space="preserve">   applies to every study   ·   learned from a found while building, auditing SIGCM clause 1 from outside, 04-Sep-2026</w:t>
+      </w:r>
+    </w:p>
+    <w:p>
+      <w:pPr>
+        <w:spacing w:after="100"/>
+      </w:pPr>
+      <w:r>
+        <w:rPr>
+          <w:b w:val="0"/>
+          <w:i w:val="0"/>
+          <w:color w:val="1A1D21"/>
+          <w:sz w:val="21"/>
+        </w:rPr>
+        <w:t>A rule adopted before there was any way to enforce it does not acquire enforcement by being important. It acquires it when somebody goes back and asks which of the old rules are still running on trust.</w:t>
+      </w:r>
+    </w:p>
+    <w:p>
+      <w:pPr>
+        <w:spacing w:after="60"/>
+        <w:ind w:left="283"/>
+      </w:pPr>
+      <w:r>
+        <w:rPr>
+          <w:b w:val="0"/>
+          <w:i w:val="0"/>
+          <w:color w:val="5B6570"/>
+          <w:sz w:val="19"/>
+        </w:rPr>
+        <w:t>How we know.  SIGCM clause 1 — historicals from the company's own filings, never a vendor or press — predates every enforcement rule in the standing protocol, was never in doubt, and was checked only by a boolean each study set on itself. Two delivered studies were in plain breach. One took its revenue, profit and balance sheet from trade press and an aggregator while its audited statements sat on the company's own website, six PDFs one click from the homepage: equity EGP 6,020.3mn filed against 5,240.0mn used, cash 4,762.3mn against 3,850.0mn, depreciation 122.5mn against 418.1mn — every error understating the company.</w:t>
+      </w:r>
+    </w:p>
+    <w:p>
+      <w:pPr>
+        <w:spacing w:after="160"/>
+        <w:ind w:left="283"/>
+      </w:pPr>
+      <w:r>
+        <w:rPr>
+          <w:b w:val="0"/>
+          <w:i w:val="0"/>
+          <w:color w:val="5B6570"/>
+          <w:sz w:val="19"/>
+        </w:rPr>
+        <w:t>What would overturn it.  An old rule found to have been enforced all along by something nobody had noticed, which would mean the audit should look for the enforcement before assuming its absence.</w:t>
+      </w:r>
+    </w:p>
+    <w:p>
+      <w:pPr>
+        <w:keepNext/>
+        <w:spacing w:before="240" w:after="60"/>
+      </w:pPr>
+      <w:r>
+        <w:rPr>
+          <w:b/>
+          <w:color w:val="1A1D21"/>
+          <w:sz w:val="22"/>
+        </w:rPr>
+        <w:t>L-271  TRY THE COMPANY'S OWN WEBSITE. IT IS USUALLY THERE.</w:t>
+      </w:r>
+    </w:p>
+    <w:p>
+      <w:pPr>
+        <w:keepNext/>
+        <w:spacing w:after="100"/>
+      </w:pPr>
+      <w:r>
+        <w:rPr>
+          <w:b/>
+          <w:color w:val="1D6FA3"/>
+          <w:sz w:val="16"/>
+        </w:rPr>
+        <w:t>EVERY STUDY</w:t>
+      </w:r>
+      <w:r>
+        <w:rPr>
+          <w:color w:val="5B6570"/>
+          <w:sz w:val="16"/>
+        </w:rPr>
+        <w:t xml:space="preserve">   applies to every study   ·   learned from a found while building, fetching SCEM's audited statements, 04-Sep-2026</w:t>
+      </w:r>
+    </w:p>
+    <w:p>
+      <w:pPr>
+        <w:spacing w:after="100"/>
+      </w:pPr>
+      <w:r>
+        <w:rPr>
+          <w:b w:val="0"/>
+          <w:i w:val="0"/>
+          <w:color w:val="1A1D21"/>
+          <w:sz w:val="21"/>
+        </w:rPr>
+        <w:t>Before any aggregator, before any press report, before concluding a filing cannot be obtained: fetch the company's own site and list its links. The rule has said so since August 2026 and the cost of not doing it is measured in whole studies.</w:t>
+      </w:r>
+    </w:p>
+    <w:p>
+      <w:pPr>
+        <w:spacing w:after="60"/>
+        <w:ind w:left="283"/>
+      </w:pPr>
+      <w:r>
+        <w:rPr>
+          <w:b w:val="0"/>
+          <w:i w:val="0"/>
+          <w:color w:val="5B6570"/>
+          <w:sz w:val="19"/>
+        </w:rPr>
+        <w:t>How we know.  Sinai Cement's homepage carries six audited financial statements as direct PDF links — FY2022 through FY2025 and the reviewed Q1-2026 — with no authentication and no investor-relations portal to navigate. The study valuing the company had used trade press and an aggregator for every historical, and its sweep register logs no attempt on the site either way, which the primary-source rule requires even when the attempt fails.</w:t>
+      </w:r>
+    </w:p>
+    <w:p>
+      <w:pPr>
+        <w:spacing w:after="160"/>
+        <w:ind w:left="283"/>
+      </w:pPr>
+      <w:r>
+        <w:rPr>
+          <w:b w:val="0"/>
+          <w:i w:val="0"/>
+          <w:color w:val="5B6570"/>
+          <w:sz w:val="19"/>
+        </w:rPr>
+        <w:t>What would overturn it.  A company whose site genuinely carries nothing, where the attempt is logged as a failure and the escalation ladder runs — which is the rule working, not a counter-example to it.</w:t>
       </w:r>
     </w:p>
     <w:p>

</xml_diff>

<commit_message>
State: AIRARABIA done — the terminal correction ran the other way on a pegged market
Co-Authored-By: Claude Opus 5 <noreply@anthropic.com>
Claude-Session: https://claude.ai/code/session_017RcjXG4ETjADcoFJf123yY
</commit_message>
<xml_diff>
--- a/engine/Lessons_Register.docx
+++ b/engine/Lessons_Register.docx
@@ -430,7 +430,7 @@
                 <w:color w:val="1A1D21"/>
                 <w:sz w:val="18"/>
               </w:rPr>
-              <w:t>189</w:t>
+              <w:t>191</w:t>
             </w:r>
           </w:p>
         </w:tc>
@@ -526,7 +526,7 @@
                 <w:color w:val="1A1D21"/>
                 <w:sz w:val="18"/>
               </w:rPr>
-              <w:t>220</w:t>
+              <w:t>222</w:t>
             </w:r>
           </w:p>
         </w:tc>
@@ -716,7 +716,7 @@
                 <w:color w:val="1A1D21"/>
                 <w:sz w:val="18"/>
               </w:rPr>
-              <w:t>145</w:t>
+              <w:t>147</w:t>
             </w:r>
           </w:p>
         </w:tc>
@@ -16159,6 +16159,164 @@
           <w:sz w:val="19"/>
         </w:rPr>
         <w:t>What would overturn it.  A census whose unreadable entries, once opened, turn out no worse than its readable ones — which would make the bucket a coverage problem rather than a sampling one.</w:t>
+      </w:r>
+    </w:p>
+    <w:p>
+      <w:pPr>
+        <w:keepNext/>
+        <w:spacing w:before="240" w:after="60"/>
+      </w:pPr>
+      <w:r>
+        <w:rPr>
+          <w:b/>
+          <w:color w:val="1A1D21"/>
+          <w:sz w:val="22"/>
+        </w:rPr>
+        <w:t>L-300  A BUILDER THAT OTHER FILES READ BY CELL ADDRESS MUST PUBLISH WHERE ITS ROWS LANDED. Only the builder knows; every other file carries a guess that was true once.</w:t>
+      </w:r>
+    </w:p>
+    <w:p>
+      <w:pPr>
+        <w:keepNext/>
+        <w:spacing w:after="100"/>
+      </w:pPr>
+      <w:r>
+        <w:rPr>
+          <w:b/>
+          <w:color w:val="1D6FA3"/>
+          <w:sz w:val="16"/>
+        </w:rPr>
+        <w:t>EVERY STUDY</w:t>
+      </w:r>
+      <w:r>
+        <w:rPr>
+          <w:color w:val="5B6570"/>
+          <w:sz w:val="16"/>
+        </w:rPr>
+        <w:t xml:space="preserve">   applies to every study   ·   learned from a found while building, AIRARABIA, 04-Sep-2026</w:t>
+      </w:r>
+    </w:p>
+    <w:p>
+      <w:pPr>
+        <w:spacing w:after="100"/>
+      </w:pPr>
+      <w:r>
+        <w:rPr>
+          <w:b w:val="0"/>
+          <w:i w:val="0"/>
+          <w:color w:val="1A1D21"/>
+          <w:sz w:val="21"/>
+        </w:rPr>
+        <w:t>Insert a row into a workbook and every check naming a cell below it goes on reading confidently from the wrong one. Nothing errors — the cells exist and hold numbers — so the failure arrives as a CONFIDENT WRONG ANSWER rather than a crash, and it arrives dressed as a finding about the model. The fix is not care: it is that the builder writes its row map beside the workbook and the checks resolve through it, so the map has one author and moving a row moves everything that reads it.</w:t>
+      </w:r>
+    </w:p>
+    <w:p>
+      <w:pPr>
+        <w:spacing w:after="60"/>
+        <w:ind w:left="283"/>
+      </w:pPr>
+      <w:r>
+        <w:rPr>
+          <w:b w:val="0"/>
+          <w:i w:val="0"/>
+          <w:color w:val="5B6570"/>
+          <w:sz w:val="19"/>
+        </w:rPr>
+        <w:t>How we know.  Rebuilding a terminal block on the sanctioned construction inserted five rows. Five other sheets referenced the discounting sheet by address, and so did both study-local checks: the recalculation gate reported 25 formula cells disagreeing with the model, every one of them the CHECK looking one row too high, while the workbook itself was correct and had asserted all 663 of its own formulas against recorded expectations. It is [L-067] for the third time in one session — a check that names a cell by address moves with the re-issue — and the first two fixes were both re-pointings of the individual reference.</w:t>
+      </w:r>
+    </w:p>
+    <w:p>
+      <w:pPr>
+        <w:spacing w:after="160"/>
+        <w:ind w:left="283"/>
+      </w:pPr>
+      <w:r>
+        <w:rPr>
+          <w:b w:val="0"/>
+          <w:i w:val="0"/>
+          <w:color w:val="5B6570"/>
+          <w:sz w:val="19"/>
+        </w:rPr>
+        <w:t>What would overturn it.  A workbook nothing else reads by address, where the map is a cost with no benefit. The moment a second file names a cell, it applies.</w:t>
+      </w:r>
+    </w:p>
+    <w:p>
+      <w:pPr>
+        <w:keepNext/>
+        <w:spacing w:before="240" w:after="60"/>
+      </w:pPr>
+      <w:r>
+        <w:rPr>
+          <w:b/>
+          <w:color w:val="1A1D21"/>
+          <w:sz w:val="22"/>
+        </w:rPr>
+        <w:t>L-301  A CHECK THAT READS A FIELD NAME CAN ACCUSE AS EASILY AS IT CAN MISS, AND A FALSE ACCUSATION IS THE MORE EXPENSIVE ERROR, because the author fixes something that was not broken.</w:t>
+      </w:r>
+    </w:p>
+    <w:p>
+      <w:pPr>
+        <w:keepNext/>
+        <w:spacing w:after="100"/>
+      </w:pPr>
+      <w:r>
+        <w:rPr>
+          <w:b/>
+          <w:color w:val="1D6FA3"/>
+          <w:sz w:val="16"/>
+        </w:rPr>
+        <w:t>EVERY STUDY</w:t>
+      </w:r>
+      <w:r>
+        <w:rPr>
+          <w:color w:val="5B6570"/>
+          <w:sz w:val="16"/>
+        </w:rPr>
+        <w:t xml:space="preserve">   applies to every study   ·   learned from a found while building, terminal_growth_census.py and AIRARABIA, 04-Sep-2026</w:t>
+      </w:r>
+    </w:p>
+    <w:p>
+      <w:pPr>
+        <w:spacing w:after="100"/>
+      </w:pPr>
+      <w:r>
+        <w:rPr>
+          <w:b w:val="0"/>
+          <w:i w:val="0"/>
+          <w:color w:val="1A1D21"/>
+          <w:sz w:val="21"/>
+        </w:rPr>
+        <w:t>[R-MACRO-01 AMENDED] records this from one side: a check reading what a process DECLARES is not checking what it DOES, so work hides where the check does not reach. The other side is that the same check can fire on a study doing exactly the right thing and SAYING SO — and the natural remedy, deleting the honest sentence, makes the record worse while turning the check green. Where a check reads prose, its MESSAGE must distinguish the two failures it can produce; where it reads a key, the key must be named for what it holds.</w:t>
+      </w:r>
+    </w:p>
+    <w:p>
+      <w:pPr>
+        <w:spacing w:after="60"/>
+        <w:ind w:left="283"/>
+      </w:pPr>
+      <w:r>
+        <w:rPr>
+          <w:b w:val="0"/>
+          <w:i w:val="0"/>
+          <w:color w:val="5B6570"/>
+          <w:sz w:val="19"/>
+        </w:rPr>
+        <w:t>How we know.  Three instances in one afternoon. A terminal-growth census asked only whether a REAL-GROWTH INPUT KEY existed and printed 'not stated' for every study without one — false of a study whose own justification said 'about 0.5pp real' in as many words; re-pointed to three states, because a SILENT study owes a disclosure and a PROSE-ONLY one owes the arithmetic moved into its register. A lens-design gate matched macro dials against a driver field that named them only to say they were HELD; a regex cutting the text at a holding word was tried and BACKED OUT (the dial usually precedes the verb), and what shipped instead was a sharper message naming the field the sentence belongs in. And an artefact-currency gate refused a row map because a field called 'central' held the integer 8 — correct on the name it was given, and a naming defect before it was a gate problem.</w:t>
+      </w:r>
+    </w:p>
+    <w:p>
+      <w:pPr>
+        <w:spacing w:after="160"/>
+        <w:ind w:left="283"/>
+      </w:pPr>
+      <w:r>
+        <w:rPr>
+          <w:b w:val="0"/>
+          <w:i w:val="0"/>
+          <w:color w:val="5B6570"/>
+          <w:sz w:val="19"/>
+        </w:rPr>
+        <w:t>What would overturn it.  A check whose false positives are as cheap to resolve as its true positives — where firing on correct work costs only a glance, the message matters less.</w:t>
       </w:r>
     </w:p>
     <w:p>

</xml_diff>

<commit_message>
L-334: a population claim made from the shape of a problem reads like a measurement
Three tonight, all part wrong, all written before the files were opened. The
dangerous ones are not wild guesses -- they are the plausible summaries a
competent reading produces, which somebody writes to organise their own thinking
and then leaves in a commit message, a state file or a standing lesson, where the
next reader takes them for something that was counted.

The test is mechanical and cheap: before a sentence naming a set, a count or a
shared cause goes anywhere durable, open the files and count. Five minutes each
here. And when one is found wrong, correct the STRENGTH of the claim and not only
its arithmetic -- a hypothesis resting on four failures against one success with
one test left is a different object from the same sentence with the count
patched.

Co-Authored-By: Claude Opus 5 <noreply@anthropic.com>
Claude-Session: https://claude.ai/code/session_017RcjXG4ETjADcoFJf123yY
</commit_message>
<xml_diff>
--- a/engine/Lessons_Register.docx
+++ b/engine/Lessons_Register.docx
@@ -430,7 +430,7 @@
                 <w:color w:val="1A1D21"/>
                 <w:sz w:val="18"/>
               </w:rPr>
-              <w:t>222</w:t>
+              <w:t>223</w:t>
             </w:r>
           </w:p>
         </w:tc>
@@ -526,7 +526,7 @@
                 <w:color w:val="1A1D21"/>
                 <w:sz w:val="18"/>
               </w:rPr>
-              <w:t>254</w:t>
+              <w:t>255</w:t>
             </w:r>
           </w:p>
         </w:tc>
@@ -684,7 +684,7 @@
                 <w:color w:val="1A1D21"/>
                 <w:sz w:val="18"/>
               </w:rPr>
-              <w:t>21</w:t>
+              <w:t>22</w:t>
             </w:r>
           </w:p>
         </w:tc>
@@ -18766,6 +18766,85 @@
           <w:sz w:val="19"/>
         </w:rPr>
         <w:t>What would overturn it.  Nothing overturns it; what LIMITS it is that a prose record written with the figures in it is a perfectly good source for them — which is the argument for writing evidence notes with the numbers rather than with the conclusions.</w:t>
+      </w:r>
+    </w:p>
+    <w:p>
+      <w:pPr>
+        <w:keepNext/>
+        <w:spacing w:before="240" w:after="60"/>
+      </w:pPr>
+      <w:r>
+        <w:rPr>
+          <w:b/>
+          <w:color w:val="1A1D21"/>
+          <w:sz w:val="22"/>
+        </w:rPr>
+        <w:t>L-334  A CLAIM ABOUT A POPULATION MADE FROM THE SHAPE OF THE PROBLEM IS A GUESS, AND IT READS EXACTLY LIKE A MEASUREMENT</w:t>
+      </w:r>
+    </w:p>
+    <w:p>
+      <w:pPr>
+        <w:keepNext/>
+        <w:spacing w:after="100"/>
+      </w:pPr>
+      <w:r>
+        <w:rPr>
+          <w:b/>
+          <w:color w:val="1D6FA3"/>
+          <w:sz w:val="16"/>
+        </w:rPr>
+        <w:t>EVERY STUDY</w:t>
+      </w:r>
+      <w:r>
+        <w:rPr>
+          <w:color w:val="5B6570"/>
+          <w:sz w:val="16"/>
+        </w:rPr>
+        <w:t xml:space="preserve">   applies to every study   ·   learned from a self-audit, three population claims in one night, 5 September 2026</w:t>
+      </w:r>
+    </w:p>
+    <w:p>
+      <w:pPr>
+        <w:spacing w:after="100"/>
+      </w:pPr>
+      <w:r>
+        <w:rPr>
+          <w:b w:val="0"/>
+          <w:i w:val="0"/>
+          <w:color w:val="1A1D21"/>
+          <w:sz w:val="21"/>
+        </w:rPr>
+        <w:t>The dangerous ones are not wild guesses; they are the plausible summaries a competent reading of the situation produces — 'the causes split three ways', 'both remaining names are Egyptian', 'these studies still carry the retired blend'. Each is the kind of sentence somebody writes to organise their own thinking and then leaves in a commit message, a state file or a standing lesson, where the next reader takes it for something that was counted. THE TEST IS MECHANICAL AND CHEAP: before a sentence naming a set, a count or a shared cause goes anywhere durable, OPEN THE FILES AND COUNT. On the cases that produced this lesson it took five minutes each and the guesses were wrong every time. AND WHEN ONE IS FOUND WRONG, CORRECT THE STRENGTH OF THE CLAIM AND NOT ONLY ITS ARITHMETIC — a hypothesis resting on four failures against one success with one test left is a different object from the same sentence with the count patched.</w:t>
+      </w:r>
+    </w:p>
+    <w:p>
+      <w:pPr>
+        <w:spacing w:after="60"/>
+        <w:ind w:left="283"/>
+      </w:pPr>
+      <w:r>
+        <w:rPr>
+          <w:b w:val="0"/>
+          <w:i w:val="0"/>
+          <w:color w:val="5B6570"/>
+          <w:sz w:val="19"/>
+        </w:rPr>
+        <w:t>How we know.  (1) 'Two names remain on the retired construction and both are Egyptian' — wrong in both halves: one remained, and the other was a UAE filer, which also thinned the jurisdictional hypothesis the sentence was supporting. (2) 'The seven unreadable studies split three ways and some fixes are cheap' — the filename and dict-shape causes were real and NEITHER WAS SUFFICIENT; underneath, all seven need a valuation decision. (3) 'AMR and probably ADNOCDIST, ADNOCDRILL and BOROUGE carry the retired blend' — right for one, wrong for two, which carry a dual framing and a published range instead. Every one was written before the files were opened, and every one was corrected by opening them.</w:t>
+      </w:r>
+    </w:p>
+    <w:p>
+      <w:pPr>
+        <w:spacing w:after="160"/>
+        <w:ind w:left="283"/>
+      </w:pPr>
+      <w:r>
+        <w:rPr>
+          <w:b w:val="0"/>
+          <w:i w:val="0"/>
+          <w:color w:val="5B6570"/>
+          <w:sz w:val="19"/>
+        </w:rPr>
+        <w:t>What would overturn it.  Nothing overturns it. What limits it is that a guess EXPLICITLY labelled as one, in a place that expects hypotheses, is a legitimate and useful thing to write down — the offence is the guess that travels into a durable record wearing a measurement's clothes.</w:t>
       </w:r>
     </w:p>
     <w:p>

</xml_diff>